<commit_message>
Actualizar enlaces con el sitio desplegado en Netlify
Sitio en produccion: https://comparador-familias.netlify.app/
Se actualiza README.md, informe/INFORME_TECNICO.md y se agrega el
Paso 9 (despliegue) al informe de desarrollo paso a paso, con captura
real del sitio funcionando en produccion.

Co-Authored-By: Claude Sonnet 5 <noreply@anthropic.com>
</commit_message>
<xml_diff>
--- a/informe/INFORME_DESARROLLO_PASO_A_PASO.docx
+++ b/informe/INFORME_DESARROLLO_PASO_A_PASO.docx
@@ -2741,6 +2741,109 @@
         <w:spacing w:after="200" w:before="400"/>
       </w:pPr>
       <w:r>
+        <w:t xml:space="preserve">Paso 9 · Despliegue en Netlify</w:t>
+      </w:r>
+    </w:p>
+    <w:p>
+      <w:pPr>
+        <w:spacing w:after="160"/>
+      </w:pPr>
+      <w:r>
+        <w:t xml:space="preserve">Con dist/ generada y verificada, el equipo desplegó el sitio en Netlify arrastrando esa carpeta a un sitio nuevo. El sitio quedó publicado en:</w:t>
+      </w:r>
+    </w:p>
+    <w:p>
+      <w:pPr>
+        <w:spacing w:after="200"/>
+        <w:jc w:val="center"/>
+      </w:pPr>
+      <w:r>
+        <w:rPr>
+          <w:b/>
+          <w:bCs/>
+          <w:color w:val="C1440E"/>
+          <w:sz w:val="24"/>
+          <w:szCs w:val="24"/>
+        </w:rPr>
+        <w:t xml:space="preserve">https://comparador-familias.netlify.app/</w:t>
+      </w:r>
+    </w:p>
+    <w:p>
+      <w:pPr>
+        <w:spacing w:after="160"/>
+      </w:pPr>
+      <w:r>
+        <w:t xml:space="preserve">La captura siguiente es del sitio en producción (nótese la insignia "Powered by Netlify" en la esquina inferior derecha), cargando y verificando los modelos exactamente igual que en local.</w:t>
+      </w:r>
+    </w:p>
+    <w:p>
+      <w:pPr>
+        <w:spacing w:after="80" w:before="200"/>
+        <w:jc w:val="center"/>
+      </w:pPr>
+      <w:r>
+        <w:drawing>
+          <wp:inline distT="0" distB="0" distL="0" distR="0">
+            <wp:extent cx="5334000" cy="4067175"/>
+            <wp:effectExtent t="0" r="0" b="0" l="0"/>
+            <wp:docPr id="1" name="" descr="" title=""/>
+            <wp:cNvGraphicFramePr>
+              <a:graphicFrameLocks xmlns:a="http://schemas.openxmlformats.org/drawingml/2006/main" noChangeAspect="1"/>
+            </wp:cNvGraphicFramePr>
+            <a:graphic xmlns:a="http://schemas.openxmlformats.org/drawingml/2006/main">
+              <a:graphicData uri="http://schemas.openxmlformats.org/drawingml/2006/picture">
+                <pic:pic xmlns:pic="http://schemas.openxmlformats.org/drawingml/2006/picture">
+                  <pic:nvPicPr>
+                    <pic:cNvPr id="0" name="" descr=""/>
+                    <pic:cNvPicPr>
+                      <a:picLocks noChangeAspect="1" noChangeArrowheads="1"/>
+                    </pic:cNvPicPr>
+                  </pic:nvPicPr>
+                  <pic:blipFill>
+                    <a:blip r:embed="rId28" cstate="none"/>
+                    <a:srcRect/>
+                    <a:stretch>
+                      <a:fillRect/>
+                    </a:stretch>
+                  </pic:blipFill>
+                  <pic:spPr bwMode="auto">
+                    <a:xfrm>
+                      <a:off x="0" y="0"/>
+                      <a:ext cx="5334000" cy="4067175"/>
+                    </a:xfrm>
+                    <a:prstGeom prst="rect">
+                      <a:avLst/>
+                    </a:prstGeom>
+                  </pic:spPr>
+                </pic:pic>
+              </a:graphicData>
+            </a:graphic>
+          </wp:inline>
+        </w:drawing>
+      </w:r>
+    </w:p>
+    <w:p>
+      <w:pPr>
+        <w:spacing w:after="240"/>
+        <w:jc w:val="center"/>
+      </w:pPr>
+      <w:r>
+        <w:rPr>
+          <w:i/>
+          <w:iCs/>
+          <w:color w:val="4A5A63"/>
+          <w:sz w:val="19"/>
+          <w:szCs w:val="19"/>
+        </w:rPr>
+        <w:t xml:space="preserve">Figura 9.1 — Sitio en producción en comparador-familias.netlify.app, modelos cargados y verificados por SHA-256.</w:t>
+      </w:r>
+    </w:p>
+    <w:p>
+      <w:pPr>
+        <w:pStyle w:val="Heading1"/>
+        <w:spacing w:after="200" w:before="400"/>
+      </w:pPr>
+      <w:r>
         <w:t xml:space="preserve">Resumen del proceso completo</w:t>
       </w:r>
     </w:p>
@@ -3241,6 +3344,59 @@
           </w:p>
         </w:tc>
       </w:tr>
+      <w:tr>
+        <w:tc>
+          <w:tcPr>
+            <w:tcW w:type="dxa" w:w="1200"/>
+          </w:tcPr>
+          <w:p>
+            <w:r>
+              <w:rPr>
+                <w:b w:val="false"/>
+                <w:bCs w:val="false"/>
+                <w:color w:val="000000"/>
+                <w:sz w:val="19"/>
+                <w:szCs w:val="19"/>
+              </w:rPr>
+              <w:t xml:space="preserve">9</w:t>
+            </w:r>
+          </w:p>
+        </w:tc>
+        <w:tc>
+          <w:tcPr>
+            <w:tcW w:type="dxa" w:w="5600"/>
+          </w:tcPr>
+          <w:p>
+            <w:r>
+              <w:rPr>
+                <w:b w:val="false"/>
+                <w:bCs w:val="false"/>
+                <w:color w:val="000000"/>
+                <w:sz w:val="19"/>
+                <w:szCs w:val="19"/>
+              </w:rPr>
+              <w:t xml:space="preserve">Despliegue en Netlify (comparador-familias.netlify.app)</w:t>
+            </w:r>
+          </w:p>
+        </w:tc>
+        <w:tc>
+          <w:tcPr>
+            <w:tcW w:type="dxa" w:w="2800"/>
+          </w:tcPr>
+          <w:p>
+            <w:r>
+              <w:rPr>
+                <w:b w:val="false"/>
+                <w:bCs w:val="false"/>
+                <w:color w:val="000000"/>
+                <w:sz w:val="19"/>
+                <w:szCs w:val="19"/>
+              </w:rPr>
+              <w:t xml:space="preserve">Figura 9.1</w:t>
+            </w:r>
+          </w:p>
+        </w:tc>
+      </w:tr>
     </w:tbl>
     <w:p>
       <w:pPr>
@@ -3262,7 +3418,7 @@
           <w:sz w:val="20"/>
           <w:szCs w:val="20"/>
         </w:rPr>
-        <w:t xml:space="preserve">Pendiente de decisión del equipo: fecha de entrega, nombre del sitio de Netlify y el despliegue final. El detalle teórico completo (formulación, criterio de optimización, algoritmo de aprendizaje y verificación de cada modelo) está en informe/INFORME_TECNICO.md, dentro del mismo repositorio.</w:t>
+        <w:t xml:space="preserve">Enlaces finales: repositorio https://github.com/Calamar49/Comparativo-de-Familias · sitio https://comparador-familias.netlify.app/. Pendiente solo de decisión del equipo: la fecha de entrega. El detalle teórico completo (formulación, criterio de optimización, algoritmo de aprendizaje y verificación de cada modelo) está en informe/INFORME_TECNICO.md, dentro del mismo repositorio.</w:t>
       </w:r>
     </w:p>
     <w:sectPr>

</xml_diff>